<commit_message>
cambio en visualizacion ayuno
</commit_message>
<xml_diff>
--- a/TFG/TFG_Roberto_Casaban_KcalTracker.docx
+++ b/TFG/TFG_Roberto_Casaban_KcalTracker.docx
@@ -1255,7 +1255,7 @@
                 <w:szCs w:val="20"/>
                 <w:rFonts w:ascii="Calibri" w:cs="Calibri" w:eastAsia="Calibri" w:hAnsi="Calibri"/>
               </w:rPr>
-              <w:t xml:space="preserve">Desarrollo (47d x 5h x 12€/h)</w:t>
+              <w:t xml:space="preserve">Desarrollo (47d x 5h x 28 €/h)</w:t>
             </w:r>
           </w:p>
         </w:tc>
@@ -1319,7 +1319,7 @@
                 <w:szCs w:val="20"/>
                 <w:rFonts w:ascii="Calibri" w:cs="Calibri" w:eastAsia="Calibri" w:hAnsi="Calibri"/>
               </w:rPr>
-              <w:t xml:space="preserve">2.820 €</w:t>
+              <w:t xml:space="preserve">6.580 €</w:t>
             </w:r>
           </w:p>
         </w:tc>
@@ -1653,7 +1653,7 @@
                 <w:szCs w:val="20"/>
                 <w:rFonts w:ascii="Calibri" w:cs="Calibri" w:eastAsia="Calibri" w:hAnsi="Calibri"/>
               </w:rPr>
-              <w:t xml:space="preserve">TOTAL</w:t>
+              <w:t xml:space="preserve">SUBTOTAL (base imponible)</w:t>
             </w:r>
           </w:p>
         </w:tc>
@@ -1717,7 +1717,208 @@
                 <w:szCs w:val="20"/>
                 <w:rFonts w:ascii="Calibri" w:cs="Calibri" w:eastAsia="Calibri" w:hAnsi="Calibri"/>
               </w:rPr>
-              <w:t xml:space="preserve">2.945 €</w:t>
+              <w:t xml:space="preserve">6.705 €</w:t>
+            </w:r>
+          </w:p>
+        </w:tc>
+      </w:tr>
+      <w:tr>
+        <w:tc>
+          <w:tcPr>
+            <w:tcW w:type="dxa" w:w="4500"/>
+            <w:tcBorders>
+              <w:top w:val="single" w:color="CBD5E0" w:sz="1"/>
+              <w:left w:val="single" w:color="CBD5E0" w:sz="1"/>
+              <w:bottom w:val="single" w:color="CBD5E0" w:sz="1"/>
+              <w:right w:val="single" w:color="CBD5E0" w:sz="1"/>
+            </w:tcBorders>
+            <w:shd w:fill="EBF4FF" w:val="clear"/>
+            <w:tcMar>
+              <w:top w:type="dxa" w:w="60"/>
+              <w:left w:type="dxa" w:w="100"/>
+              <w:bottom w:type="dxa" w:w="60"/>
+              <w:right w:type="dxa" w:w="100"/>
+            </w:tcMar>
+          </w:tcPr>
+          <w:p>
+            <w:pPr>
+              <w:jc w:val="left"/>
+            </w:pPr>
+            <w:r>
+              <w:rPr>
+                <w:b w:val="1"/>
+                <w:bCs w:val="1"/>
+                <w:sz w:val="20"/>
+                <w:szCs w:val="20"/>
+                <w:rFonts w:ascii="Calibri" w:cs="Calibri" w:eastAsia="Calibri" w:hAnsi="Calibri"/>
+              </w:rPr>
+              <w:t xml:space="preserve">IVA 21 %</w:t>
+            </w:r>
+          </w:p>
+        </w:tc>
+        <w:tc>
+          <w:tcPr>
+            <w:tcW w:type="dxa" w:w="2300"/>
+            <w:tcBorders>
+              <w:top w:val="single" w:color="CBD5E0" w:sz="1"/>
+              <w:left w:val="single" w:color="CBD5E0" w:sz="1"/>
+              <w:bottom w:val="single" w:color="CBD5E0" w:sz="1"/>
+              <w:right w:val="single" w:color="CBD5E0" w:sz="1"/>
+            </w:tcBorders>
+            <w:shd w:fill="EBF4FF" w:val="clear"/>
+            <w:tcMar>
+              <w:top w:type="dxa" w:w="60"/>
+              <w:left w:type="dxa" w:w="100"/>
+              <w:bottom w:type="dxa" w:w="60"/>
+              <w:right w:type="dxa" w:w="100"/>
+            </w:tcMar>
+          </w:tcPr>
+          <w:p>
+            <w:pPr>
+              <w:jc w:val="center"/>
+            </w:pPr>
+            <w:r>
+              <w:rPr>
+                <w:b w:val="false"/>
+                <w:bCs w:val="false"/>
+                <w:sz w:val="20"/>
+                <w:szCs w:val="20"/>
+                <w:rFonts w:ascii="Calibri" w:cs="Calibri" w:eastAsia="Calibri" w:hAnsi="Calibri"/>
+              </w:rPr>
+              <w:t xml:space="preserve"/>
+            </w:r>
+          </w:p>
+        </w:tc>
+        <w:tc>
+          <w:tcPr>
+            <w:tcW w:type="dxa" w:w="2226"/>
+            <w:tcBorders>
+              <w:top w:val="single" w:color="CBD5E0" w:sz="1"/>
+              <w:left w:val="single" w:color="CBD5E0" w:sz="1"/>
+              <w:bottom w:val="single" w:color="CBD5E0" w:sz="1"/>
+              <w:right w:val="single" w:color="CBD5E0" w:sz="1"/>
+            </w:tcBorders>
+            <w:shd w:fill="EBF4FF" w:val="clear"/>
+            <w:tcMar>
+              <w:top w:type="dxa" w:w="60"/>
+              <w:left w:type="dxa" w:w="100"/>
+              <w:bottom w:type="dxa" w:w="60"/>
+              <w:right w:type="dxa" w:w="100"/>
+            </w:tcMar>
+          </w:tcPr>
+          <w:p>
+            <w:pPr>
+              <w:jc w:val="center"/>
+            </w:pPr>
+            <w:r>
+              <w:rPr>
+                <w:b w:val="1"/>
+                <w:bCs w:val="1"/>
+                <w:sz w:val="20"/>
+                <w:szCs w:val="20"/>
+                <w:rFonts w:ascii="Calibri" w:cs="Calibri" w:eastAsia="Calibri" w:hAnsi="Calibri"/>
+              </w:rPr>
+              <w:t xml:space="preserve">1.408,05 €</w:t>
+            </w:r>
+          </w:p>
+        </w:tc>
+      </w:tr>
+      <w:tr>
+        <w:tc>
+          <w:tcPr>
+            <w:tcW w:type="dxa" w:w="4500"/>
+            <w:tcBorders>
+              <w:top w:val="single" w:color="CBD5E0" w:sz="1"/>
+              <w:left w:val="single" w:color="CBD5E0" w:sz="1"/>
+              <w:bottom w:val="single" w:color="CBD5E0" w:sz="1"/>
+              <w:right w:val="single" w:color="CBD5E0" w:sz="1"/>
+            </w:tcBorders>
+            <w:tcMar>
+              <w:top w:type="dxa" w:w="60"/>
+              <w:left w:type="dxa" w:w="100"/>
+              <w:bottom w:type="dxa" w:w="60"/>
+              <w:right w:type="dxa" w:w="100"/>
+            </w:tcMar>
+          </w:tcPr>
+          <w:p>
+            <w:pPr>
+              <w:jc w:val="left"/>
+            </w:pPr>
+            <w:r>
+              <w:rPr>
+                <w:b w:val="1"/>
+                <w:bCs w:val="1"/>
+                <w:sz w:val="22"/>
+                <w:szCs w:val="22"/>
+                <w:color w:val="2B6CB0"/>
+                <w:rFonts w:ascii="Calibri" w:cs="Calibri" w:eastAsia="Calibri" w:hAnsi="Calibri"/>
+              </w:rPr>
+              <w:t xml:space="preserve">TOTAL (con IVA)</w:t>
+            </w:r>
+          </w:p>
+        </w:tc>
+        <w:tc>
+          <w:tcPr>
+            <w:tcW w:type="dxa" w:w="2300"/>
+            <w:tcBorders>
+              <w:top w:val="single" w:color="CBD5E0" w:sz="1"/>
+              <w:left w:val="single" w:color="CBD5E0" w:sz="1"/>
+              <w:bottom w:val="single" w:color="CBD5E0" w:sz="1"/>
+              <w:right w:val="single" w:color="CBD5E0" w:sz="1"/>
+            </w:tcBorders>
+            <w:tcMar>
+              <w:top w:type="dxa" w:w="60"/>
+              <w:left w:type="dxa" w:w="100"/>
+              <w:bottom w:type="dxa" w:w="60"/>
+              <w:right w:type="dxa" w:w="100"/>
+            </w:tcMar>
+          </w:tcPr>
+          <w:p>
+            <w:pPr>
+              <w:jc w:val="center"/>
+            </w:pPr>
+            <w:r>
+              <w:rPr>
+                <w:b w:val="false"/>
+                <w:bCs w:val="false"/>
+                <w:sz w:val="22"/>
+                <w:szCs w:val="22"/>
+                <w:rFonts w:ascii="Calibri" w:cs="Calibri" w:eastAsia="Calibri" w:hAnsi="Calibri"/>
+              </w:rPr>
+              <w:t xml:space="preserve"/>
+            </w:r>
+          </w:p>
+        </w:tc>
+        <w:tc>
+          <w:tcPr>
+            <w:tcW w:type="dxa" w:w="2226"/>
+            <w:tcBorders>
+              <w:top w:val="single" w:color="CBD5E0" w:sz="1"/>
+              <w:left w:val="single" w:color="CBD5E0" w:sz="1"/>
+              <w:bottom w:val="single" w:color="CBD5E0" w:sz="1"/>
+              <w:right w:val="single" w:color="CBD5E0" w:sz="1"/>
+            </w:tcBorders>
+            <w:tcMar>
+              <w:top w:type="dxa" w:w="60"/>
+              <w:left w:type="dxa" w:w="100"/>
+              <w:bottom w:type="dxa" w:w="60"/>
+              <w:right w:type="dxa" w:w="100"/>
+            </w:tcMar>
+          </w:tcPr>
+          <w:p>
+            <w:pPr>
+              <w:jc w:val="center"/>
+            </w:pPr>
+            <w:r>
+              <w:rPr>
+                <w:b w:val="1"/>
+                <w:bCs w:val="1"/>
+                <w:sz w:val="22"/>
+                <w:szCs w:val="22"/>
+                <w:color w:val="2B6CB0"/>
+                <w:rFonts w:ascii="Calibri" w:cs="Calibri" w:eastAsia="Calibri" w:hAnsi="Calibri"/>
+              </w:rPr>
+              <w:t xml:space="preserve">8.113,05 €</w:t>
             </w:r>
           </w:p>
         </w:tc>
@@ -1735,6 +1936,51 @@
           <w:rFonts w:ascii="Calibri" w:cs="Calibri" w:eastAsia="Calibri" w:hAnsi="Calibri"/>
         </w:rPr>
         <w:t xml:space="preserve">Todas las herramientas principales son gratuitas, lo que hace el proyecto viable para un desarrollador independiente.</w:t>
+      </w:r>
+    </w:p>
+    <w:p>
+      <w:pPr>
+        <w:spacing w:before="200" w:after="120" w:line="276"/>
+        <w:jc w:val="both"/>
+      </w:pPr>
+      <w:r>
+        <w:rPr>
+          <w:b/>
+          <w:bCs/>
+          <w:sz w:val="22"/>
+          <w:szCs w:val="22"/>
+          <w:color w:val="2B6CB0"/>
+          <w:rFonts w:ascii="Calibri" w:cs="Calibri" w:eastAsia="Calibri" w:hAnsi="Calibri"/>
+        </w:rPr>
+        <w:t xml:space="preserve">Justificación del precio por hora</w:t>
+      </w:r>
+    </w:p>
+    <w:p>
+      <w:pPr>
+        <w:spacing w:after="120" w:line="276"/>
+        <w:jc w:val="both"/>
+      </w:pPr>
+      <w:r>
+        <w:rPr>
+          <w:sz w:val="22"/>
+          <w:szCs w:val="22"/>
+          <w:rFonts w:ascii="Calibri" w:cs="Calibri" w:eastAsia="Calibri" w:hAnsi="Calibri"/>
+        </w:rPr>
+        <w:t xml:space="preserve">La tarifa de 28 €/h se ha fijado tomando como referencia el precio de mercado de un desarrollador junior autónomo en España. A diferencia de un asalariado, el autónomo debe absorber con su propia facturación la cuota mensual de la Seguridad Social (en torno a 230–290 € en 2026 según el tramo de rendimientos), la retención de IRPF aplicada en cada factura, los gastos directos de la actividad (equipo, licencias, conexión, gestoría, seguro) y la ausencia de vacaciones, bajas o prestación por desempleo. Por este motivo la tarifa real de un freelance se sitúa habitualmente entre dos y dos veces y media el coste por hora de un asalariado equivalente, con un rango de mercado para perfiles junior entre 25 € y 35 € la hora, lo que justifica la cifra escogida.</w:t>
+      </w:r>
+    </w:p>
+    <w:p>
+      <w:pPr>
+        <w:spacing w:after="120" w:line="276"/>
+        <w:jc w:val="both"/>
+      </w:pPr>
+      <w:r>
+        <w:rPr>
+          <w:sz w:val="22"/>
+          <w:szCs w:val="22"/>
+          <w:rFonts w:ascii="Calibri" w:cs="Calibri" w:eastAsia="Calibri" w:hAnsi="Calibri"/>
+        </w:rPr>
+        <w:t xml:space="preserve">Sobre la base imponible resultante se aplica el IVA general del 21 % por tratarse de un servicio de desarrollo de software prestado en territorio nacional. Este importe no supone un ingreso para el desarrollador: se repercute al cliente en la factura y se liquida trimestralmente a la Agencia Tributaria, por lo que se muestra desglosado para reflejar el coste real que asumiría el cliente final.</w:t>
       </w:r>
     </w:p>
     <w:p>
@@ -3453,7 +3699,7 @@
           <w:szCs w:val="22"/>
           <w:rFonts w:ascii="Calibri" w:cs="Calibri" w:eastAsia="Calibri" w:hAnsi="Calibri"/>
         </w:rPr>
-        <w:t xml:space="preserve">El siguiente diagrama de actividad muestra el recorrido habitual de un usuario dentro de la aplicación: desde el acceso inicial y la autenticación (con el camino alternativo de registro para usuarios nuevos) hasta el registro de comidas y la consulta de estadísticas. El diagrama se elaboró con FigJam (Figma).</w:t>
+        <w:t xml:space="preserve">El siguiente diagrama de actividad detalla el caso de uso principal de la aplicación: el flujo de añadir una comida al registro diario. La representación se ha modelado con notación UML 2 utilizando carriles (swimlanes) para distinguir las responsabilidades de cada actor o componente: el usuario, la aplicación Android, la API externa de comidas, la persistencia local mediante ORMlite (SQLite) y el servicio remoto de Firebase Firestore. El diagrama incluye dos puntos de decisión asociados a la disponibilidad de conexión a Internet, lo que permite ilustrar tanto la búsqueda en línea de alimentos como la estrategia offline-first del almacenamiento (guardado siempre en local y sincronización diferida con Firestore cuando se recupera la conectividad).</w:t>
       </w:r>
     </w:p>
     <w:p>
@@ -3464,9 +3710,9 @@
       <w:r>
         <w:drawing>
           <wp:inline distT="0" distB="0" distL="0" distR="0">
-            <wp:extent cx="4114800" cy="5177000"/>
+            <wp:extent cx="4114800" cy="5298862"/>
             <wp:effectExtent t="0" r="0" b="0" l="0"/>
-            <wp:docPr id="99" name="flujo_actividad" descr="Diagrama de flujo de actividad del usuario" title="Flujo de actividad"/>
+            <wp:docPr id="99" name="anadir_comida" descr="Diagrama de actividad del flujo Anadir Comida con swimlanes" title="Anadir Comida"/>
             <wp:cNvGraphicFramePr>
               <a:graphicFrameLocks xmlns:a="http://schemas.openxmlformats.org/drawingml/2006/main" noChangeAspect="1"/>
             </wp:cNvGraphicFramePr>
@@ -3489,7 +3735,7 @@
                   <pic:spPr bwMode="auto">
                     <a:xfrm>
                       <a:off x="0" y="0"/>
-                      <a:ext cx="4114800" cy="5177000"/>
+                      <a:ext cx="4114800" cy="5298862"/>
                     </a:xfrm>
                     <a:prstGeom prst="rect">
                       <a:avLst/>

</xml_diff>